<commit_message>
week 10 exercise, demo added
</commit_message>
<xml_diff>
--- a/Exercises/Day52-02-JS SumForm.docx
+++ b/Exercises/Day52-02-JS SumForm.docx
@@ -124,11 +124,15 @@
       </w:r>
     </w:p>
     <w:p>
-      <w:pPr>
-        <w:rPr>
-          <w:lang w:val="en-US"/>
-        </w:rPr>
-      </w:pPr>
+      <w:r>
+        <w:rPr>
+          <w:lang w:val="en-US"/>
+        </w:rPr>
+        <w:t xml:space="preserve">Hint - </w:t>
+      </w:r>
+      <w:r>
+        <w:t>.style.backgroundColor = "white";</w:t>
+      </w:r>
     </w:p>
     <w:p>
       <w:pPr>

</xml_diff>